<commit_message>
hub doc 55 v2: F12/D7 con el login real de Cloudflare (Sign in with GitHub)
</commit_message>
<xml_diff>
--- a/_integration/docs/ust/UST-2026-09-27-20-cloudflare-security-insights.docx
+++ b/_integration/docs/ust/UST-2026-09-27-20-cloudflare-security-insights.docx
@@ -710,7 +710,7 @@
                 <w:sz w:val="16"/>
                 <w:szCs w:val="16"/>
               </w:rPr>
-              <w:t xml:space="preserve">`juanjose.cebrian@outlook.com` sin segundo factor (hallazgo «Users without MFA»). Es la cuenta que aloja las tres Pages, el DNS, Access (Zero Trust) y Turnstile: una contraseña filtrada = la web, el hub y el correo (DNS) en manos ajenas. Es también la cuenta de GitHub (mapa canónico). Miembros: solo Juanjo (a confirmar en Manage Account → Members).</w:t>
+              <w:t xml:space="preserve">`juanjose.cebrian@outlook.com` entra por **«Sign in with GitHub»** (verificado 27-sep con la pantalla de login: perfil de GitHub «Last used»; también aparece un perfil de Google con el gmail, que sería OTRA cuenta). No hay contraseña propia de Cloudflare: la seguridad de Pages ×3, DNS, Access y Turnstile es la de la cuenta de GitHub (contraseña + 2FA + recovery codes). El hallazgo «Users without MFA» del panel se refiere a la 2FA de Cloudflare, que con login social puede no existir: se resuelve en el perfil o se archiva con motivo. Miembros: solo Juanjo (a confirmar en Manage Account → Members).</w:t>
             </w:r>
           </w:p>
         </w:tc>
@@ -1972,7 +1972,7 @@
                 <w:sz w:val="16"/>
                 <w:szCs w:val="16"/>
               </w:rPr>
-              <w:t xml:space="preserve">Es la llave del garaje (Pages ×3, DNS, Access, Turnstile, GitHub comparte identidad). Pasos: (1) dash.cloudflare.com → icono de perfil → My Profile → Authentication → Two-Factor Authentication → Set Up → app de autenticación (la misma que ya usas) → código → activar; (2) descargar los **backup codes** y guardarlos en el gestor compartido con Pilar y Lucía (regla 11-ago: ninguna llave en una sola cabeza), NUNCA en el chat ni en el repo; (3) revisar Authentication → Active sessions y cerrar las que no reconozcas; (4) Manage Account → Members → Invite: Pilar (pgonzalez… o su gmail founder) como **Administrator** con 2FA obligatoria (Account → Configurations → «Enforce two-factor authentication»): continuidad real sin depender de tu móvil (D7). Lucía, si lo pide.</w:t>
+              <w:t xml:space="preserve">VERIFICADO el 27-sep (captura de la pantalla de login de Juanjo): en Cloudflare se entra con «Sign in with GitHub» (juanjose.cebrian@outlook.com); NO hay contraseña propia de Cloudflare. La llave del garaje es, por tanto, la cuenta de GitHub. Pasos: (1) github.com/settings/security → Two-factor authentication: si no está «Enabled», activarla con la app de autenticación; (2) descargar los **recovery codes** de GitHub y guardarlos en el gestor compartido con Pilar y Lucía (regla 11-ago), NUNCA en el chat ni en el repo; (3) la contraseña de GitHub también al gestor (si no se recuerda: github.com → «Forgot password?» → correo de Outlook); (4) en Cloudflare, My Profile → Authentication: anotar qué ofrece a una cuenta con login social (¿«Set password»? ¿2FA propia?) — si permite 2FA propia, activarla y guardar sus backup codes; si no, el hallazgo «Users without MFA» se archiva con el motivo «identidad por GitHub con 2FA y recovery codes en el gestor»; (5) revisar Authentication → Active sessions y cerrar las que no se reconozcan; (6) Manage Account → Members → Invite: Pilar como Administrator, con «Enforce two-factor authentication» en Account → Configurations (continuidad, D7). No usar nunca el perfil de Google (juanjose.cebrian@gmail.com) que aparece en la pantalla de login: en Cloudflare es OTRA cuenta (como crimson-pond-9361 el 5-sep); la de NutriSync es la de GitHub.</w:t>
             </w:r>
           </w:p>
         </w:tc>
@@ -1999,7 +1999,7 @@
                 <w:sz w:val="16"/>
                 <w:szCs w:val="16"/>
               </w:rPr>
-              <w:t xml:space="preserve">My Profile muestra 2FA «Enabled»; insight desaparece; la ficha del gestor compartido tiene los backup codes con fecha; Members muestra a Pilar aceptada y con 2FA. Prueba real: cerrar sesión y entrar con el código.</w:t>
+              <w:t xml:space="preserve">GitHub muestra 2FA «Enabled»; los recovery codes de GitHub están en el gestor compartido con fecha; My Profile → Authentication de Cloudflare anotado (con 2FA propia activa, o archivo del insight con motivo); Members muestra a Pilar aceptada y con 2FA. Prueba real: cerrar sesión en Cloudflare y volver a entrar con GitHub (te pedirá el segundo factor de GitHub).</w:t>
             </w:r>
           </w:p>
         </w:tc>
@@ -3782,7 +3782,7 @@
                 <w:sz w:val="16"/>
                 <w:szCs w:val="16"/>
               </w:rPr>
-              <w:t xml:space="preserve">2FA en la cuenta con app de autenticación + backup codes al gestor compartido + Pilar como Administrator con 2FA obligatoria (continuidad).</w:t>
+              <w:t xml:space="preserve">La identidad de Cloudflare es la cuenta de GitHub (login social, sin contraseña propia — verificado 27-sep): 2FA de GitHub activa + recovery codes y contraseña de GitHub al gestor compartido; en Cloudflare, 2FA propia si el perfil la ofrece a cuentas con login social (si no, archivar el insight con motivo) + Pilar como Administrator con 2FA obligatoria (continuidad).</w:t>
             </w:r>
           </w:p>
         </w:tc>
@@ -3809,7 +3809,7 @@
                 <w:sz w:val="16"/>
                 <w:szCs w:val="16"/>
               </w:rPr>
-              <w:t xml:space="preserve">Solo 2FA, sin miembros nuevos (la cuenta sigue dependiendo de una sola persona).</w:t>
+              <w:t xml:space="preserve">Añadir una contraseña propia de Cloudflare («Set password») y llevar la 2FA allí, dejando de entrar por GitHub (dos identidades que mantener; solo si GitHub no pudiera tener 2FA).</w:t>
             </w:r>
           </w:p>
         </w:tc>

</xml_diff>

<commit_message>
Repaso hub (27-sep, tanda 1): 8-oct fuera de 9 páginas (hitos desde plan_hitos), decisiones con timeline desde sprints+hitos y enlaces //hub arreglados, un candado en textos (MFA/24h → TOTP opcional/30 días) en mfa/access/guía/navbar/leads/waitlist, daily-ops copias reales (backup-auto 4 h), pilot load()→refreshOv + sin tarjeta founders inventada, feedback → sprint actual, finance loadPP, obs etiquetas del embudo, launch-plan v2 superado por GA-1, Pitch storyline sin 8-oct · docs 55 v3 + 56 (UST-21)
</commit_message>
<xml_diff>
--- a/_integration/docs/ust/UST-2026-09-27-20-cloudflare-security-insights.docx
+++ b/_integration/docs/ust/UST-2026-09-27-20-cloudflare-security-insights.docx
@@ -710,7 +710,7 @@
                 <w:sz w:val="16"/>
                 <w:szCs w:val="16"/>
               </w:rPr>
-              <w:t xml:space="preserve">`juanjose.cebrian@outlook.com` entra por **«Sign in with GitHub»** (verificado 27-sep con la pantalla de login: perfil de GitHub «Last used»; también aparece un perfil de Google con el gmail, que sería OTRA cuenta). No hay contraseña propia de Cloudflare: la seguridad de Pages ×3, DNS, Access y Turnstile es la de la cuenta de GitHub (contraseña + 2FA + recovery codes). El hallazgo «Users without MFA» del panel se refiere a la 2FA de Cloudflare, que con login social puede no existir: se resuelve en el perfil o se archiva con motivo. Miembros: solo Juanjo (a confirmar en Manage Account → Members).</w:t>
+              <w:t xml:space="preserve">`juanjose.cebrian@outlook.com` entra por **«Sign in with GitHub»** (verificado 27-sep con la pantalla de login: perfil de GitHub «Last used»; también aparece un perfil de Google con el gmail, que sería OTRA cuenta). La cuenta SÍ tiene contraseña propia de Cloudflare (el panel la pide al activar el 2FA; Juanjo no la tecleaba porque entra por GitHub): la seguridad de Pages ×3, DNS, Access y Turnstile depende de las DOS puertas (GitHub con su 2FA, y la contraseña + 2FA de Cloudflare). El hallazgo «Users without MFA» se resuelve activando el 2FA Mobile App en My Profile → Authentication; los backup codes van al gestor compartido, nunca al chat. Miembros: solo Juanjo (a confirmar en Manage Account → Members).</w:t>
             </w:r>
           </w:p>
         </w:tc>
@@ -1972,7 +1972,7 @@
                 <w:sz w:val="16"/>
                 <w:szCs w:val="16"/>
               </w:rPr>
-              <w:t xml:space="preserve">VERIFICADO el 27-sep (captura de la pantalla de login de Juanjo): en Cloudflare se entra con «Sign in with GitHub» (juanjose.cebrian@outlook.com); NO hay contraseña propia de Cloudflare. La llave del garaje es, por tanto, la cuenta de GitHub. Pasos: (1) github.com/settings/security → Two-factor authentication: si no está «Enabled», activarla con la app de autenticación; (2) descargar los **recovery codes** de GitHub y guardarlos en el gestor compartido con Pilar y Lucía (regla 11-ago), NUNCA en el chat ni en el repo; (3) la contraseña de GitHub también al gestor (si no se recuerda: github.com → «Forgot password?» → correo de Outlook); (4) en Cloudflare, My Profile → Authentication: anotar qué ofrece a una cuenta con login social (¿«Set password»? ¿2FA propia?) — si permite 2FA propia, activarla y guardar sus backup codes; si no, el hallazgo «Users without MFA» se archiva con el motivo «identidad por GitHub con 2FA y recovery codes en el gestor»; (5) revisar Authentication → Active sessions y cerrar las que no se reconozcan; (6) Manage Account → Members → Invite: Pilar como Administrator, con «Enforce two-factor authentication» en Account → Configurations (continuidad, D7). No usar nunca el perfil de Google (juanjose.cebrian@gmail.com) que aparece en la pantalla de login: en Cloudflare es OTRA cuenta (como crimson-pond-9361 el 5-sep); la de NutriSync es la de GitHub.</w:t>
+              <w:t xml:space="preserve">VERIFICADO el 27-sep (captura de la pantalla de login de Juanjo): en Cloudflare se entra con «Sign in with GitHub» (juanjose.cebrian@outlook.com); La cuenta SÍ conserva una contraseña propia de Cloudflare: el panel la pide al activar 2FA (tras escanear el QR) y en otros cambios sensibles; Juanjo no la recuerda porque nunca la teclea. Paso previo: «Forgot your password?» en el formulario de correo+contraseña del login → enlace al buzón de Outlook → contraseña nueva → al gestor compartido en el acto (el login por GitHub sigue funcionando igual). Pasos: (1) github.com/settings/security → Two-factor authentication: si no está «Enabled», activarla con la app de autenticación; (2) descargar los **recovery codes** de GitHub y guardarlos en el gestor compartido con Pilar y Lucía (regla 11-ago), NUNCA en el chat ni en el repo; (3) la contraseña de GitHub también al gestor (si no se recuerda: github.com → «Forgot password?» → correo de Outlook); (4) en Cloudflare, My Profile → Authentication: anotar qué ofrece a una cuenta con login social (¿«Set password»? ¿2FA propia?) — si permite 2FA propia, activarla y guardar sus backup codes; si no, el hallazgo «Users without MFA» se archiva con el motivo «identidad por GitHub con 2FA y recovery codes en el gestor»; (5) revisar Authentication → Active sessions y cerrar las que no se reconozcan; (6) Manage Account → Members → Invite: Pilar como Administrator, con «Enforce two-factor authentication» en Account → Configurations (continuidad, D7). No usar nunca el perfil de Google (juanjose.cebrian@gmail.com) que aparece en la pantalla de login: en Cloudflare es OTRA cuenta (como crimson-pond-9361 el 5-sep); la de NutriSync es la de GitHub.</w:t>
             </w:r>
           </w:p>
         </w:tc>
@@ -3782,7 +3782,7 @@
                 <w:sz w:val="16"/>
                 <w:szCs w:val="16"/>
               </w:rPr>
-              <w:t xml:space="preserve">La identidad de Cloudflare es la cuenta de GitHub (login social, sin contraseña propia — verificado 27-sep): 2FA de GitHub activa + recovery codes y contraseña de GitHub al gestor compartido; en Cloudflare, 2FA propia si el perfil la ofrece a cuentas con login social (si no, archivar el insight con motivo) + Pilar como Administrator con 2FA obligatoria (continuidad).</w:t>
+              <w:t xml:space="preserve">La cuenta de Cloudflare tiene DOS puertas y las dos se aseguran: el login «Sign in with GitHub» (→ 2FA de GitHub activa + recovery codes de GitHub al gestor) y su contraseña PROPIA de Cloudflare, que el panel exige para activar el 2FA y para cambios sensibles (verificado 27-sep) → restablecerla («Forgot your password?» → Outlook), guardarla en el gestor, activar 2FA Mobile App y regenerar los backup codes; los valores que pasaron por el chat el 27-sep se rotan antes de GA (UST-21, D0). Pilar como Administrator con 2FA obligatoria (continuidad).</w:t>
             </w:r>
           </w:p>
         </w:tc>

</xml_diff>